<commit_message>
2025 09 16 14 17
</commit_message>
<xml_diff>
--- a/fizika11.docx
+++ b/fizika11.docx
@@ -1224,21 +1224,7 @@
           <w:vertAlign w:val="baseline"/>
           <w:lang w:val="hu-HU"/>
         </w:rPr>
-        <w:t>/</w:t>
-      </w:r>
-      <w:r>
-        <w:rPr>
-          <w:b w:val="false"/>
-          <w:bCs w:val="false"/>
-          <w:position w:val="0"/>
-          <w:sz w:val="24"/>
-          <w:sz w:val="24"/>
-          <w:szCs w:val="24"/>
-          <w:u w:val="none"/>
-          <w:vertAlign w:val="baseline"/>
-          <w:lang w:val="hu-HU"/>
-        </w:rPr>
-        <w:t>r</w:t>
+        <w:t>/r</w:t>
       </w:r>
       <w:r>
         <w:rPr>
@@ -2261,7 +2247,19 @@
           <w:vertAlign w:val="baseline"/>
           <w:lang w:val="hu-HU"/>
         </w:rPr>
-        <w:t>*(</w:t>
+        <w:t>*(1/r</w:t>
+      </w:r>
+      <w:r>
+        <w:rPr>
+          <w:b w:val="false"/>
+          <w:bCs w:val="false"/>
+          <w:sz w:val="24"/>
+          <w:szCs w:val="24"/>
+          <w:u w:val="none"/>
+          <w:vertAlign w:val="superscript"/>
+          <w:lang w:val="hu-HU"/>
+        </w:rPr>
+        <w:t>2</w:t>
       </w:r>
       <w:r>
         <w:rPr>
@@ -2275,7 +2273,45 @@
           <w:vertAlign w:val="baseline"/>
           <w:lang w:val="hu-HU"/>
         </w:rPr>
-        <w:t>1</w:t>
+        <w:t>)</w:t>
+      </w:r>
+    </w:p>
+    <w:p>
+      <w:pPr>
+        <w:pStyle w:val="Normal"/>
+        <w:bidi w:val="0"/>
+        <w:jc w:val="start"/>
+        <w:rPr>
+          <w:b w:val="false"/>
+          <w:bCs w:val="false"/>
+          <w:sz w:val="24"/>
+          <w:szCs w:val="24"/>
+          <w:u w:val="none"/>
+          <w:lang w:val="hu-HU"/>
+        </w:rPr>
+      </w:pPr>
+      <w:r>
+        <w:rPr>
+          <w:b w:val="false"/>
+          <w:bCs w:val="false"/>
+          <w:sz w:val="24"/>
+          <w:szCs w:val="24"/>
+          <w:u w:val="none"/>
+          <w:lang w:val="hu-HU"/>
+        </w:rPr>
+        <w:t>10/9*10</w:t>
+      </w:r>
+      <w:r>
+        <w:rPr>
+          <w:b w:val="false"/>
+          <w:bCs w:val="false"/>
+          <w:sz w:val="24"/>
+          <w:szCs w:val="24"/>
+          <w:u w:val="none"/>
+          <w:vertAlign w:val="superscript"/>
+          <w:lang w:val="hu-HU"/>
+        </w:rPr>
+        <w:t>9</w:t>
       </w:r>
       <w:r>
         <w:rPr>
@@ -2289,7 +2325,7 @@
           <w:vertAlign w:val="baseline"/>
           <w:lang w:val="hu-HU"/>
         </w:rPr>
-        <w:t>/r</w:t>
+        <w:t>=1/r</w:t>
       </w:r>
       <w:r>
         <w:rPr>
@@ -2303,6 +2339,44 @@
         </w:rPr>
         <w:t>2</w:t>
       </w:r>
+    </w:p>
+    <w:p>
+      <w:pPr>
+        <w:pStyle w:val="Normal"/>
+        <w:bidi w:val="0"/>
+        <w:jc w:val="start"/>
+        <w:rPr>
+          <w:b w:val="false"/>
+          <w:bCs w:val="false"/>
+          <w:sz w:val="24"/>
+          <w:szCs w:val="24"/>
+          <w:u w:val="none"/>
+          <w:lang w:val="hu-HU"/>
+        </w:rPr>
+      </w:pPr>
+      <w:r>
+        <w:rPr>
+          <w:b w:val="false"/>
+          <w:bCs w:val="false"/>
+          <w:sz w:val="24"/>
+          <w:szCs w:val="24"/>
+          <w:u w:val="none"/>
+          <w:lang w:val="hu-HU"/>
+        </w:rPr>
+        <w:t>0.11*10</w:t>
+      </w:r>
+      <w:r>
+        <w:rPr>
+          <w:b w:val="false"/>
+          <w:bCs w:val="false"/>
+          <w:sz w:val="24"/>
+          <w:szCs w:val="24"/>
+          <w:u w:val="none"/>
+          <w:vertAlign w:val="superscript"/>
+          <w:lang w:val="hu-HU"/>
+        </w:rPr>
+        <w:t>-8</w:t>
+      </w:r>
       <w:r>
         <w:rPr>
           <w:b w:val="false"/>
@@ -2315,6 +2389,96 @@
           <w:vertAlign w:val="baseline"/>
           <w:lang w:val="hu-HU"/>
         </w:rPr>
+        <w:t>=1/r</w:t>
+      </w:r>
+      <w:r>
+        <w:rPr>
+          <w:b w:val="false"/>
+          <w:bCs w:val="false"/>
+          <w:sz w:val="24"/>
+          <w:szCs w:val="24"/>
+          <w:u w:val="none"/>
+          <w:vertAlign w:val="superscript"/>
+          <w:lang w:val="hu-HU"/>
+        </w:rPr>
+        <w:t>2</w:t>
+      </w:r>
+    </w:p>
+    <w:p>
+      <w:pPr>
+        <w:pStyle w:val="Normal"/>
+        <w:bidi w:val="0"/>
+        <w:jc w:val="start"/>
+        <w:rPr>
+          <w:b w:val="false"/>
+          <w:bCs w:val="false"/>
+          <w:sz w:val="24"/>
+          <w:szCs w:val="24"/>
+          <w:u w:val="none"/>
+          <w:lang w:val="hu-HU"/>
+        </w:rPr>
+      </w:pPr>
+      <w:r>
+        <w:rPr>
+          <w:b w:val="false"/>
+          <w:bCs w:val="false"/>
+          <w:sz w:val="24"/>
+          <w:szCs w:val="24"/>
+          <w:u w:val="none"/>
+          <w:lang w:val="hu-HU"/>
+        </w:rPr>
+        <w:t>r</w:t>
+      </w:r>
+      <w:r>
+        <w:rPr>
+          <w:b w:val="false"/>
+          <w:bCs w:val="false"/>
+          <w:sz w:val="24"/>
+          <w:szCs w:val="24"/>
+          <w:u w:val="none"/>
+          <w:vertAlign w:val="superscript"/>
+          <w:lang w:val="hu-HU"/>
+        </w:rPr>
+        <w:t>2</w:t>
+      </w:r>
+      <w:r>
+        <w:rPr>
+          <w:b w:val="false"/>
+          <w:bCs w:val="false"/>
+          <w:position w:val="0"/>
+          <w:sz w:val="24"/>
+          <w:sz w:val="24"/>
+          <w:szCs w:val="24"/>
+          <w:u w:val="none"/>
+          <w:vertAlign w:val="baseline"/>
+          <w:lang w:val="hu-HU"/>
+        </w:rPr>
+        <w:t>=1/(11*10</w:t>
+      </w:r>
+      <w:r>
+        <w:rPr>
+          <w:b w:val="false"/>
+          <w:bCs w:val="false"/>
+          <w:sz w:val="24"/>
+          <w:szCs w:val="24"/>
+          <w:u w:val="none"/>
+          <w:vertAlign w:val="superscript"/>
+          <w:lang w:val="hu-HU"/>
+        </w:rPr>
+        <w:t>-10</w:t>
+      </w:r>
+      <w:r>
+        <w:rPr>
+          <w:b w:val="false"/>
+          <w:bCs w:val="false"/>
+          <w:position w:val="0"/>
+          <w:sz w:val="24"/>
+          <w:sz w:val="24"/>
+          <w:szCs w:val="24"/>
+          <w:u w:val="none"/>
+          <w:vertAlign w:val="baseline"/>
+          <w:lang w:val="hu-HU"/>
+        </w:rPr>
         <w:t>)</w:t>
       </w:r>
     </w:p>
@@ -2341,7 +2505,21 @@
           <w:u w:val="none"/>
           <w:lang w:val="hu-HU"/>
         </w:rPr>
-        <w:t>10/9*10</w:t>
+        <w:t>r=sqrt(</w:t>
+      </w:r>
+      <w:r>
+        <w:rPr>
+          <w:b w:val="false"/>
+          <w:bCs w:val="false"/>
+          <w:position w:val="0"/>
+          <w:sz w:val="24"/>
+          <w:sz w:val="24"/>
+          <w:szCs w:val="24"/>
+          <w:u w:val="none"/>
+          <w:vertAlign w:val="baseline"/>
+          <w:lang w:val="hu-HU"/>
+        </w:rPr>
+        <w:t>1/(11*10</w:t>
       </w:r>
       <w:r>
         <w:rPr>
@@ -2353,7 +2531,7 @@
           <w:vertAlign w:val="superscript"/>
           <w:lang w:val="hu-HU"/>
         </w:rPr>
-        <w:t>9</w:t>
+        <w:t>-10</w:t>
       </w:r>
       <w:r>
         <w:rPr>
@@ -2367,228 +2545,8 @@
           <w:vertAlign w:val="baseline"/>
           <w:lang w:val="hu-HU"/>
         </w:rPr>
-        <w:t>=1/r</w:t>
-      </w:r>
-      <w:r>
-        <w:rPr>
-          <w:b w:val="false"/>
-          <w:bCs w:val="false"/>
-          <w:sz w:val="24"/>
-          <w:szCs w:val="24"/>
-          <w:u w:val="none"/>
-          <w:vertAlign w:val="superscript"/>
-          <w:lang w:val="hu-HU"/>
-        </w:rPr>
-        <w:t>2</w:t>
-      </w:r>
-    </w:p>
-    <w:p>
-      <w:pPr>
-        <w:pStyle w:val="Normal"/>
-        <w:bidi w:val="0"/>
-        <w:jc w:val="start"/>
-        <w:rPr>
-          <w:b w:val="false"/>
-          <w:bCs w:val="false"/>
-          <w:sz w:val="24"/>
-          <w:szCs w:val="24"/>
-          <w:u w:val="none"/>
-          <w:lang w:val="hu-HU"/>
-        </w:rPr>
-      </w:pPr>
-      <w:r>
-        <w:rPr>
-          <w:b w:val="false"/>
-          <w:bCs w:val="false"/>
-          <w:sz w:val="24"/>
-          <w:szCs w:val="24"/>
-          <w:u w:val="none"/>
-          <w:lang w:val="hu-HU"/>
-        </w:rPr>
-        <w:t>0.11*10</w:t>
-      </w:r>
-      <w:r>
-        <w:rPr>
-          <w:b w:val="false"/>
-          <w:bCs w:val="false"/>
-          <w:sz w:val="24"/>
-          <w:szCs w:val="24"/>
-          <w:u w:val="none"/>
-          <w:vertAlign w:val="superscript"/>
-          <w:lang w:val="hu-HU"/>
-        </w:rPr>
-        <w:t>-8</w:t>
-      </w:r>
-      <w:r>
-        <w:rPr>
-          <w:b w:val="false"/>
-          <w:bCs w:val="false"/>
-          <w:position w:val="0"/>
-          <w:sz w:val="24"/>
-          <w:sz w:val="24"/>
-          <w:szCs w:val="24"/>
-          <w:u w:val="none"/>
-          <w:vertAlign w:val="baseline"/>
-          <w:lang w:val="hu-HU"/>
-        </w:rPr>
-        <w:t>=1/r</w:t>
-      </w:r>
-      <w:r>
-        <w:rPr>
-          <w:b w:val="false"/>
-          <w:bCs w:val="false"/>
-          <w:sz w:val="24"/>
-          <w:szCs w:val="24"/>
-          <w:u w:val="none"/>
-          <w:vertAlign w:val="superscript"/>
-          <w:lang w:val="hu-HU"/>
-        </w:rPr>
-        <w:t>2</w:t>
-      </w:r>
-    </w:p>
-    <w:p>
-      <w:pPr>
-        <w:pStyle w:val="Normal"/>
-        <w:bidi w:val="0"/>
-        <w:jc w:val="start"/>
-        <w:rPr>
-          <w:b w:val="false"/>
-          <w:bCs w:val="false"/>
-          <w:sz w:val="24"/>
-          <w:szCs w:val="24"/>
-          <w:u w:val="none"/>
-          <w:lang w:val="hu-HU"/>
-        </w:rPr>
-      </w:pPr>
-      <w:r>
-        <w:rPr>
-          <w:b w:val="false"/>
-          <w:bCs w:val="false"/>
-          <w:sz w:val="24"/>
-          <w:szCs w:val="24"/>
-          <w:u w:val="none"/>
-          <w:lang w:val="hu-HU"/>
-        </w:rPr>
-        <w:t>r</w:t>
-      </w:r>
-      <w:r>
-        <w:rPr>
-          <w:b w:val="false"/>
-          <w:bCs w:val="false"/>
-          <w:sz w:val="24"/>
-          <w:szCs w:val="24"/>
-          <w:u w:val="none"/>
-          <w:vertAlign w:val="superscript"/>
-          <w:lang w:val="hu-HU"/>
-        </w:rPr>
-        <w:t>2</w:t>
-      </w:r>
-      <w:r>
-        <w:rPr>
-          <w:b w:val="false"/>
-          <w:bCs w:val="false"/>
-          <w:position w:val="0"/>
-          <w:sz w:val="24"/>
-          <w:sz w:val="24"/>
-          <w:szCs w:val="24"/>
-          <w:u w:val="none"/>
-          <w:vertAlign w:val="baseline"/>
-          <w:lang w:val="hu-HU"/>
-        </w:rPr>
-        <w:t>=1/(11*10</w:t>
-      </w:r>
-      <w:r>
-        <w:rPr>
-          <w:b w:val="false"/>
-          <w:bCs w:val="false"/>
-          <w:sz w:val="24"/>
-          <w:szCs w:val="24"/>
-          <w:u w:val="none"/>
-          <w:vertAlign w:val="superscript"/>
-          <w:lang w:val="hu-HU"/>
-        </w:rPr>
-        <w:t>-10</w:t>
-      </w:r>
-      <w:r>
-        <w:rPr>
-          <w:b w:val="false"/>
-          <w:bCs w:val="false"/>
-          <w:position w:val="0"/>
-          <w:sz w:val="24"/>
-          <w:sz w:val="24"/>
-          <w:szCs w:val="24"/>
-          <w:u w:val="none"/>
-          <w:vertAlign w:val="baseline"/>
-          <w:lang w:val="hu-HU"/>
-        </w:rPr>
         <w:t>)</w:t>
       </w:r>
-    </w:p>
-    <w:p>
-      <w:pPr>
-        <w:pStyle w:val="Normal"/>
-        <w:bidi w:val="0"/>
-        <w:jc w:val="start"/>
-        <w:rPr>
-          <w:b w:val="false"/>
-          <w:bCs w:val="false"/>
-          <w:sz w:val="24"/>
-          <w:szCs w:val="24"/>
-          <w:u w:val="none"/>
-          <w:lang w:val="hu-HU"/>
-        </w:rPr>
-      </w:pPr>
-      <w:r>
-        <w:rPr>
-          <w:b w:val="false"/>
-          <w:bCs w:val="false"/>
-          <w:sz w:val="24"/>
-          <w:szCs w:val="24"/>
-          <w:u w:val="none"/>
-          <w:lang w:val="hu-HU"/>
-        </w:rPr>
-        <w:t>r=sqrt(</w:t>
-      </w:r>
-      <w:r>
-        <w:rPr>
-          <w:b w:val="false"/>
-          <w:bCs w:val="false"/>
-          <w:position w:val="0"/>
-          <w:sz w:val="24"/>
-          <w:sz w:val="24"/>
-          <w:szCs w:val="24"/>
-          <w:u w:val="none"/>
-          <w:vertAlign w:val="baseline"/>
-          <w:lang w:val="hu-HU"/>
-        </w:rPr>
-        <w:t>1/(11*10</w:t>
-      </w:r>
-      <w:r>
-        <w:rPr>
-          <w:b w:val="false"/>
-          <w:bCs w:val="false"/>
-          <w:sz w:val="24"/>
-          <w:szCs w:val="24"/>
-          <w:u w:val="none"/>
-          <w:vertAlign w:val="superscript"/>
-          <w:lang w:val="hu-HU"/>
-        </w:rPr>
-        <w:t>-10</w:t>
-      </w:r>
-      <w:r>
-        <w:rPr>
-          <w:b w:val="false"/>
-          <w:bCs w:val="false"/>
-          <w:position w:val="0"/>
-          <w:sz w:val="24"/>
-          <w:sz w:val="24"/>
-          <w:szCs w:val="24"/>
-          <w:u w:val="none"/>
-          <w:vertAlign w:val="baseline"/>
-          <w:lang w:val="hu-HU"/>
-        </w:rPr>
-        <w:t>)</w:t>
-      </w:r>
       <w:r>
         <w:rPr>
           <w:b w:val="false"/>
@@ -2599,6 +2557,538 @@
           <w:lang w:val="hu-HU"/>
         </w:rPr>
         <w:t>)=30151.1345m</w:t>
+      </w:r>
+    </w:p>
+    <w:p>
+      <w:pPr>
+        <w:pStyle w:val="Normal"/>
+        <w:bidi w:val="0"/>
+        <w:jc w:val="start"/>
+        <w:rPr>
+          <w:b w:val="false"/>
+          <w:bCs w:val="false"/>
+          <w:sz w:val="24"/>
+          <w:szCs w:val="24"/>
+          <w:u w:val="none"/>
+          <w:lang w:val="hu-HU"/>
+        </w:rPr>
+      </w:pPr>
+      <w:r>
+        <w:rPr>
+          <w:b w:val="false"/>
+          <w:bCs w:val="false"/>
+          <w:sz w:val="24"/>
+          <w:szCs w:val="24"/>
+          <w:u w:val="none"/>
+          <w:lang w:val="hu-HU"/>
+        </w:rPr>
+      </w:r>
+    </w:p>
+    <w:p>
+      <w:pPr>
+        <w:pStyle w:val="Normal"/>
+        <w:bidi w:val="0"/>
+        <w:jc w:val="start"/>
+        <w:rPr>
+          <w:b w:val="false"/>
+          <w:bCs w:val="false"/>
+          <w:sz w:val="24"/>
+          <w:szCs w:val="24"/>
+          <w:u w:val="none"/>
+          <w:lang w:val="hu-HU"/>
+        </w:rPr>
+      </w:pPr>
+      <w:r>
+        <w:rPr>
+          <w:b w:val="false"/>
+          <w:bCs w:val="false"/>
+          <w:sz w:val="24"/>
+          <w:szCs w:val="24"/>
+          <w:u w:val="none"/>
+          <w:lang w:val="hu-HU"/>
+        </w:rPr>
+      </w:r>
+    </w:p>
+    <w:p>
+      <w:pPr>
+        <w:pStyle w:val="Normal"/>
+        <w:bidi w:val="0"/>
+        <w:jc w:val="center"/>
+        <w:rPr>
+          <w:b/>
+          <w:bCs/>
+          <w:sz w:val="36"/>
+          <w:szCs w:val="36"/>
+          <w:u w:val="none"/>
+          <w:lang w:val="hu-HU"/>
+        </w:rPr>
+      </w:pPr>
+      <w:r>
+        <w:rPr>
+          <w:b/>
+          <w:bCs/>
+          <w:sz w:val="36"/>
+          <w:szCs w:val="36"/>
+          <w:u w:val="none"/>
+          <w:lang w:val="hu-HU"/>
+        </w:rPr>
+        <w:t>Az elektromos mező (Térerősség)</w:t>
+      </w:r>
+    </w:p>
+    <w:p>
+      <w:pPr>
+        <w:pStyle w:val="Normal"/>
+        <w:bidi w:val="0"/>
+        <w:jc w:val="start"/>
+        <w:rPr>
+          <w:b w:val="false"/>
+          <w:bCs w:val="false"/>
+          <w:sz w:val="24"/>
+          <w:szCs w:val="24"/>
+          <w:u w:val="none"/>
+          <w:lang w:val="hu-HU"/>
+        </w:rPr>
+      </w:pPr>
+      <w:r>
+        <w:rPr>
+          <w:b w:val="false"/>
+          <w:bCs w:val="false"/>
+          <w:sz w:val="24"/>
+          <w:szCs w:val="24"/>
+          <w:u w:val="none"/>
+          <w:lang w:val="hu-HU"/>
+        </w:rPr>
+      </w:r>
+    </w:p>
+    <w:p>
+      <w:pPr>
+        <w:pStyle w:val="Normal"/>
+        <w:numPr>
+          <w:ilvl w:val="0"/>
+          <w:numId w:val="7"/>
+        </w:numPr>
+        <w:bidi w:val="0"/>
+        <w:jc w:val="start"/>
+        <w:rPr>
+          <w:b w:val="false"/>
+          <w:bCs w:val="false"/>
+          <w:sz w:val="24"/>
+          <w:szCs w:val="24"/>
+          <w:u w:val="none"/>
+          <w:lang w:val="hu-HU"/>
+        </w:rPr>
+      </w:pPr>
+      <w:r>
+        <w:rPr>
+          <w:b w:val="false"/>
+          <w:bCs w:val="false"/>
+          <w:sz w:val="24"/>
+          <w:szCs w:val="24"/>
+          <w:u w:val="none"/>
+          <w:lang w:val="hu-HU"/>
+        </w:rPr>
+        <w:t>A létezését Faraday fedezte fel a XIX. Században.</w:t>
+      </w:r>
+    </w:p>
+    <w:p>
+      <w:pPr>
+        <w:pStyle w:val="Normal"/>
+        <w:numPr>
+          <w:ilvl w:val="0"/>
+          <w:numId w:val="7"/>
+        </w:numPr>
+        <w:bidi w:val="0"/>
+        <w:jc w:val="start"/>
+        <w:rPr>
+          <w:b w:val="false"/>
+          <w:bCs w:val="false"/>
+          <w:sz w:val="24"/>
+          <w:szCs w:val="24"/>
+          <w:u w:val="none"/>
+          <w:lang w:val="hu-HU"/>
+        </w:rPr>
+      </w:pPr>
+      <w:r>
+        <w:rPr>
+          <w:b w:val="false"/>
+          <w:bCs w:val="false"/>
+          <w:sz w:val="24"/>
+          <w:szCs w:val="24"/>
+          <w:u w:val="none"/>
+          <w:lang w:val="hu-HU"/>
+        </w:rPr>
+        <w:t>Az elektromos mező az enyag létező, sajátos nem atomi felépítésű formájya.</w:t>
+      </w:r>
+    </w:p>
+    <w:p>
+      <w:pPr>
+        <w:pStyle w:val="Normal"/>
+        <w:numPr>
+          <w:ilvl w:val="0"/>
+          <w:numId w:val="7"/>
+        </w:numPr>
+        <w:bidi w:val="0"/>
+        <w:jc w:val="start"/>
+        <w:rPr>
+          <w:b w:val="false"/>
+          <w:bCs w:val="false"/>
+          <w:sz w:val="24"/>
+          <w:szCs w:val="24"/>
+          <w:u w:val="none"/>
+          <w:lang w:val="hu-HU"/>
+        </w:rPr>
+      </w:pPr>
+      <w:r>
+        <w:rPr>
+          <w:b w:val="false"/>
+          <w:bCs w:val="false"/>
+          <w:sz w:val="24"/>
+          <w:szCs w:val="24"/>
+          <w:u w:val="none"/>
+          <w:lang w:val="hu-HU"/>
+        </w:rPr>
+        <w:t>A zelektromos mzőt valamely pontjában a próbatöltésre ható erő és a próbatültés hányadoával jellemezzük. A hányados neve elektromos téreősség. Jele:E</w:t>
+      </w:r>
+    </w:p>
+    <w:p>
+      <w:pPr>
+        <w:pStyle w:val="Normal"/>
+        <w:numPr>
+          <w:ilvl w:val="0"/>
+          <w:numId w:val="7"/>
+        </w:numPr>
+        <w:bidi w:val="0"/>
+        <w:jc w:val="start"/>
+        <w:rPr>
+          <w:b w:val="false"/>
+          <w:bCs w:val="false"/>
+          <w:sz w:val="24"/>
+          <w:szCs w:val="24"/>
+          <w:u w:val="none"/>
+          <w:lang w:val="hu-HU"/>
+        </w:rPr>
+      </w:pPr>
+      <w:r>
+        <w:rPr>
+          <w:b w:val="false"/>
+          <w:bCs w:val="false"/>
+          <w:sz w:val="24"/>
+          <w:szCs w:val="24"/>
+          <w:u w:val="none"/>
+          <w:lang w:val="hu-HU"/>
+        </w:rPr>
+        <w:t>Képlete: E = F/q; Mértékegysége: N/C</w:t>
+      </w:r>
+    </w:p>
+    <w:p>
+      <w:pPr>
+        <w:pStyle w:val="Normal"/>
+        <w:numPr>
+          <w:ilvl w:val="0"/>
+          <w:numId w:val="7"/>
+        </w:numPr>
+        <w:bidi w:val="0"/>
+        <w:jc w:val="start"/>
+        <w:rPr>
+          <w:b w:val="false"/>
+          <w:bCs w:val="false"/>
+          <w:sz w:val="24"/>
+          <w:szCs w:val="24"/>
+          <w:u w:val="none"/>
+          <w:lang w:val="hu-HU"/>
+        </w:rPr>
+      </w:pPr>
+      <w:r>
+        <w:rPr>
+          <w:b w:val="false"/>
+          <w:bCs w:val="false"/>
+          <w:sz w:val="24"/>
+          <w:szCs w:val="24"/>
+          <w:u w:val="none"/>
+          <w:lang w:val="hu-HU"/>
+        </w:rPr>
+        <w:t>A térerősség vektormennyiség! Irányának a pozitív próbatöltésre ható erő irányát tekintjük. (megállapodás)</w:t>
+      </w:r>
+    </w:p>
+    <w:p>
+      <w:pPr>
+        <w:pStyle w:val="Normal"/>
+        <w:bidi w:val="0"/>
+        <w:jc w:val="start"/>
+        <w:rPr>
+          <w:b w:val="false"/>
+          <w:bCs w:val="false"/>
+          <w:sz w:val="24"/>
+          <w:szCs w:val="24"/>
+          <w:u w:val="none"/>
+          <w:lang w:val="hu-HU"/>
+        </w:rPr>
+      </w:pPr>
+      <w:r>
+        <w:rPr>
+          <w:b w:val="false"/>
+          <w:bCs w:val="false"/>
+          <w:sz w:val="24"/>
+          <w:szCs w:val="24"/>
+          <w:u w:val="none"/>
+          <w:lang w:val="hu-HU"/>
+        </w:rPr>
+      </w:r>
+    </w:p>
+    <w:p>
+      <w:pPr>
+        <w:pStyle w:val="Normal"/>
+        <w:bidi w:val="0"/>
+        <w:jc w:val="start"/>
+        <w:rPr>
+          <w:b w:val="false"/>
+          <w:bCs w:val="false"/>
+          <w:sz w:val="24"/>
+          <w:szCs w:val="24"/>
+          <w:u w:val="none"/>
+          <w:lang w:val="hu-HU"/>
+        </w:rPr>
+      </w:pPr>
+      <w:r>
+        <w:rPr>
+          <w:b w:val="false"/>
+          <w:bCs w:val="false"/>
+          <w:sz w:val="24"/>
+          <w:szCs w:val="24"/>
+          <w:u w:val="none"/>
+          <w:lang w:val="hu-HU"/>
+        </w:rPr>
+      </w:r>
+    </w:p>
+    <w:p>
+      <w:pPr>
+        <w:pStyle w:val="Normal"/>
+        <w:bidi w:val="0"/>
+        <w:jc w:val="start"/>
+        <w:rPr>
+          <w:b w:val="false"/>
+          <w:bCs w:val="false"/>
+          <w:sz w:val="24"/>
+          <w:szCs w:val="24"/>
+          <w:u w:val="none"/>
+          <w:lang w:val="hu-HU"/>
+        </w:rPr>
+      </w:pPr>
+      <w:r>
+        <w:rPr>
+          <w:b w:val="false"/>
+          <w:bCs w:val="false"/>
+          <w:sz w:val="24"/>
+          <w:szCs w:val="24"/>
+          <w:u w:val="none"/>
+          <w:lang w:val="hu-HU"/>
+        </w:rPr>
+      </w:r>
+    </w:p>
+    <w:p>
+      <w:pPr>
+        <w:pStyle w:val="Normal"/>
+        <w:bidi w:val="0"/>
+        <w:jc w:val="start"/>
+        <w:rPr>
+          <w:b/>
+          <w:bCs/>
+          <w:sz w:val="24"/>
+          <w:szCs w:val="24"/>
+          <w:u w:val="none"/>
+          <w:lang w:val="hu-HU"/>
+        </w:rPr>
+      </w:pPr>
+      <w:r>
+        <w:rPr>
+          <w:b/>
+          <w:bCs/>
+          <w:sz w:val="24"/>
+          <w:szCs w:val="24"/>
+          <w:u w:val="none"/>
+          <w:lang w:val="hu-HU"/>
+        </w:rPr>
+        <w:t>gyakorlás:</w:t>
+      </w:r>
+    </w:p>
+    <w:p>
+      <w:pPr>
+        <w:pStyle w:val="Normal"/>
+        <w:bidi w:val="0"/>
+        <w:jc w:val="start"/>
+        <w:rPr>
+          <w:b w:val="false"/>
+          <w:bCs w:val="false"/>
+          <w:sz w:val="24"/>
+          <w:szCs w:val="24"/>
+          <w:u w:val="none"/>
+          <w:lang w:val="hu-HU"/>
+        </w:rPr>
+      </w:pPr>
+      <w:r>
+        <w:rPr>
+          <w:b w:val="false"/>
+          <w:bCs w:val="false"/>
+          <w:sz w:val="24"/>
+          <w:szCs w:val="24"/>
+          <w:u w:val="none"/>
+          <w:lang w:val="hu-HU"/>
+        </w:rPr>
+      </w:r>
+    </w:p>
+    <w:p>
+      <w:pPr>
+        <w:pStyle w:val="Normal"/>
+        <w:bidi w:val="0"/>
+        <w:jc w:val="start"/>
+        <w:rPr>
+          <w:b w:val="false"/>
+          <w:bCs w:val="false"/>
+          <w:sz w:val="24"/>
+          <w:szCs w:val="24"/>
+          <w:u w:val="none"/>
+          <w:lang w:val="hu-HU"/>
+        </w:rPr>
+      </w:pPr>
+      <w:r>
+        <w:rPr>
+          <w:b w:val="false"/>
+          <w:bCs w:val="false"/>
+          <w:sz w:val="24"/>
+          <w:szCs w:val="24"/>
+          <w:u w:val="none"/>
+          <w:lang w:val="hu-HU"/>
+        </w:rPr>
+        <w:t>Q – mért elektromos mező</w:t>
+      </w:r>
+    </w:p>
+    <w:p>
+      <w:pPr>
+        <w:pStyle w:val="Normal"/>
+        <w:bidi w:val="0"/>
+        <w:jc w:val="start"/>
+        <w:rPr>
+          <w:b w:val="false"/>
+          <w:bCs w:val="false"/>
+          <w:sz w:val="24"/>
+          <w:szCs w:val="24"/>
+          <w:u w:val="none"/>
+          <w:lang w:val="hu-HU"/>
+        </w:rPr>
+      </w:pPr>
+      <w:r>
+        <w:rPr>
+          <w:b w:val="false"/>
+          <w:bCs w:val="false"/>
+          <w:sz w:val="24"/>
+          <w:szCs w:val="24"/>
+          <w:u w:val="none"/>
+          <w:lang w:val="hu-HU"/>
+        </w:rPr>
+        <w:t>q – próbatöltés (porszem)</w:t>
+      </w:r>
+    </w:p>
+    <w:p>
+      <w:pPr>
+        <w:pStyle w:val="Normal"/>
+        <w:bidi w:val="0"/>
+        <w:jc w:val="start"/>
+        <w:rPr>
+          <w:b w:val="false"/>
+          <w:bCs w:val="false"/>
+          <w:sz w:val="24"/>
+          <w:szCs w:val="24"/>
+          <w:u w:val="none"/>
+          <w:lang w:val="hu-HU"/>
+        </w:rPr>
+      </w:pPr>
+      <w:r>
+        <w:rPr>
+          <w:b w:val="false"/>
+          <w:bCs w:val="false"/>
+          <w:sz w:val="24"/>
+          <w:szCs w:val="24"/>
+          <w:u w:val="none"/>
+          <w:lang w:val="hu-HU"/>
+        </w:rPr>
+        <w:t>F – vektor a porszemen</w:t>
+      </w:r>
+    </w:p>
+    <w:p>
+      <w:pPr>
+        <w:pStyle w:val="Normal"/>
+        <w:bidi w:val="0"/>
+        <w:jc w:val="start"/>
+        <w:rPr>
+          <w:b w:val="false"/>
+          <w:bCs w:val="false"/>
+          <w:sz w:val="24"/>
+          <w:szCs w:val="24"/>
+          <w:u w:val="none"/>
+          <w:lang w:val="hu-HU"/>
+        </w:rPr>
+      </w:pPr>
+      <w:r>
+        <w:rPr>
+          <w:b w:val="false"/>
+          <w:bCs w:val="false"/>
+          <w:sz w:val="24"/>
+          <w:szCs w:val="24"/>
+          <w:u w:val="none"/>
+          <w:lang w:val="hu-HU"/>
+        </w:rPr>
+        <w:t>E – Térerősség</w:t>
+      </w:r>
+    </w:p>
+    <w:p>
+      <w:pPr>
+        <w:pStyle w:val="Normal"/>
+        <w:bidi w:val="0"/>
+        <w:jc w:val="start"/>
+        <w:rPr>
+          <w:b w:val="false"/>
+          <w:bCs w:val="false"/>
+          <w:sz w:val="24"/>
+          <w:szCs w:val="24"/>
+          <w:u w:val="none"/>
+          <w:lang w:val="hu-HU"/>
+        </w:rPr>
+      </w:pPr>
+      <w:r>
+        <w:rPr>
+          <w:b w:val="false"/>
+          <w:bCs w:val="false"/>
+          <w:sz w:val="24"/>
+          <w:szCs w:val="24"/>
+          <w:u w:val="none"/>
+          <w:lang w:val="hu-HU"/>
+        </w:rPr>
+        <w:t>E = F/q; mértékegység: N/C</w:t>
+      </w:r>
+    </w:p>
+    <w:p>
+      <w:pPr>
+        <w:pStyle w:val="Normal"/>
+        <w:bidi w:val="0"/>
+        <w:jc w:val="start"/>
+        <w:rPr>
+          <w:b w:val="false"/>
+          <w:bCs w:val="false"/>
+          <w:sz w:val="24"/>
+          <w:szCs w:val="24"/>
+          <w:u w:val="none"/>
+          <w:lang w:val="hu-HU"/>
+        </w:rPr>
+      </w:pPr>
+      <w:r>
+        <w:rPr>
+          <w:b w:val="false"/>
+          <w:bCs w:val="false"/>
+          <w:sz w:val="24"/>
+          <w:szCs w:val="24"/>
+          <w:u w:val="none"/>
+          <w:lang w:val="hu-HU"/>
+        </w:rPr>
       </w:r>
     </w:p>
     <w:sectPr>
@@ -3439,6 +3929,143 @@
     </w:lvl>
   </w:abstractNum>
   <w:abstractNum w:abstractNumId="7">
+    <w:lvl w:ilvl="0">
+      <w:start w:val="1"/>
+      <w:numFmt w:val="bullet"/>
+      <w:lvlText w:val=""/>
+      <w:lvlJc w:val="start"/>
+      <w:pPr>
+        <w:tabs>
+          <w:tab w:val="num" w:pos="720"/>
+        </w:tabs>
+        <w:ind w:start="720" w:hanging="360"/>
+      </w:pPr>
+      <w:rPr>
+        <w:rFonts w:ascii="Symbol" w:hAnsi="Symbol" w:cs="Symbol" w:hint="default"/>
+      </w:rPr>
+    </w:lvl>
+    <w:lvl w:ilvl="1">
+      <w:start w:val="1"/>
+      <w:numFmt w:val="bullet"/>
+      <w:lvlText w:val=""/>
+      <w:lvlJc w:val="start"/>
+      <w:pPr>
+        <w:tabs>
+          <w:tab w:val="num" w:pos="1080"/>
+        </w:tabs>
+        <w:ind w:start="1080" w:hanging="360"/>
+      </w:pPr>
+      <w:rPr>
+        <w:rFonts w:ascii="Symbol" w:hAnsi="Symbol" w:cs="Symbol" w:hint="default"/>
+      </w:rPr>
+    </w:lvl>
+    <w:lvl w:ilvl="2">
+      <w:start w:val="1"/>
+      <w:numFmt w:val="bullet"/>
+      <w:lvlText w:val=""/>
+      <w:lvlJc w:val="start"/>
+      <w:pPr>
+        <w:tabs>
+          <w:tab w:val="num" w:pos="1440"/>
+        </w:tabs>
+        <w:ind w:start="1440" w:hanging="360"/>
+      </w:pPr>
+      <w:rPr>
+        <w:rFonts w:ascii="Symbol" w:hAnsi="Symbol" w:cs="Symbol" w:hint="default"/>
+      </w:rPr>
+    </w:lvl>
+    <w:lvl w:ilvl="3">
+      <w:start w:val="1"/>
+      <w:numFmt w:val="bullet"/>
+      <w:lvlText w:val=""/>
+      <w:lvlJc w:val="start"/>
+      <w:pPr>
+        <w:tabs>
+          <w:tab w:val="num" w:pos="1800"/>
+        </w:tabs>
+        <w:ind w:start="1800" w:hanging="360"/>
+      </w:pPr>
+      <w:rPr>
+        <w:rFonts w:ascii="Symbol" w:hAnsi="Symbol" w:cs="Symbol" w:hint="default"/>
+      </w:rPr>
+    </w:lvl>
+    <w:lvl w:ilvl="4">
+      <w:start w:val="1"/>
+      <w:numFmt w:val="bullet"/>
+      <w:lvlText w:val=""/>
+      <w:lvlJc w:val="start"/>
+      <w:pPr>
+        <w:tabs>
+          <w:tab w:val="num" w:pos="2160"/>
+        </w:tabs>
+        <w:ind w:start="2160" w:hanging="360"/>
+      </w:pPr>
+      <w:rPr>
+        <w:rFonts w:ascii="Symbol" w:hAnsi="Symbol" w:cs="Symbol" w:hint="default"/>
+      </w:rPr>
+    </w:lvl>
+    <w:lvl w:ilvl="5">
+      <w:start w:val="1"/>
+      <w:numFmt w:val="bullet"/>
+      <w:lvlText w:val=""/>
+      <w:lvlJc w:val="start"/>
+      <w:pPr>
+        <w:tabs>
+          <w:tab w:val="num" w:pos="2520"/>
+        </w:tabs>
+        <w:ind w:start="2520" w:hanging="360"/>
+      </w:pPr>
+      <w:rPr>
+        <w:rFonts w:ascii="Symbol" w:hAnsi="Symbol" w:cs="Symbol" w:hint="default"/>
+      </w:rPr>
+    </w:lvl>
+    <w:lvl w:ilvl="6">
+      <w:start w:val="1"/>
+      <w:numFmt w:val="bullet"/>
+      <w:lvlText w:val=""/>
+      <w:lvlJc w:val="start"/>
+      <w:pPr>
+        <w:tabs>
+          <w:tab w:val="num" w:pos="2880"/>
+        </w:tabs>
+        <w:ind w:start="2880" w:hanging="360"/>
+      </w:pPr>
+      <w:rPr>
+        <w:rFonts w:ascii="Symbol" w:hAnsi="Symbol" w:cs="Symbol" w:hint="default"/>
+      </w:rPr>
+    </w:lvl>
+    <w:lvl w:ilvl="7">
+      <w:start w:val="1"/>
+      <w:numFmt w:val="bullet"/>
+      <w:lvlText w:val=""/>
+      <w:lvlJc w:val="start"/>
+      <w:pPr>
+        <w:tabs>
+          <w:tab w:val="num" w:pos="3240"/>
+        </w:tabs>
+        <w:ind w:start="3240" w:hanging="360"/>
+      </w:pPr>
+      <w:rPr>
+        <w:rFonts w:ascii="Symbol" w:hAnsi="Symbol" w:cs="Symbol" w:hint="default"/>
+      </w:rPr>
+    </w:lvl>
+    <w:lvl w:ilvl="8">
+      <w:start w:val="1"/>
+      <w:numFmt w:val="bullet"/>
+      <w:lvlText w:val=""/>
+      <w:lvlJc w:val="start"/>
+      <w:pPr>
+        <w:tabs>
+          <w:tab w:val="num" w:pos="3600"/>
+        </w:tabs>
+        <w:ind w:start="3600" w:hanging="360"/>
+      </w:pPr>
+      <w:rPr>
+        <w:rFonts w:ascii="Symbol" w:hAnsi="Symbol" w:cs="Symbol" w:hint="default"/>
+      </w:rPr>
+    </w:lvl>
+  </w:abstractNum>
+  <w:abstractNum w:abstractNumId="8">
     <w:lvl w:ilvl="0">
       <w:start w:val="1"/>
       <w:numFmt w:val="none"/>
@@ -3578,6 +4205,9 @@
   <w:num w:numId="7">
     <w:abstractNumId w:val="7"/>
   </w:num>
+  <w:num w:numId="8">
+    <w:abstractNumId w:val="8"/>
+  </w:num>
 </w:numbering>
 </file>
 
@@ -3605,7 +4235,7 @@
     <w:pPr>
       <w:widowControl/>
       <w:suppressAutoHyphens w:val="true"/>
-      <w:overflowPunct w:val="true"/>
+      <w:overflowPunct w:val="false"/>
       <w:bidi w:val="0"/>
       <w:spacing w:before="0" w:after="0"/>
       <w:jc w:val="start"/>
@@ -3619,15 +4249,15 @@
       <w:lang w:val="en-US" w:eastAsia="zh-CN" w:bidi="hi-IN"/>
     </w:rPr>
   </w:style>
-  <w:style w:type="character" w:styleId="Bulletsuser">
-    <w:name w:val="Bullets (user)"/>
+  <w:style w:type="character" w:styleId="Bullets">
+    <w:name w:val="Bullets"/>
     <w:qFormat/>
     <w:rPr>
       <w:rFonts w:ascii="OpenSymbol" w:hAnsi="OpenSymbol" w:eastAsia="OpenSymbol" w:cs="OpenSymbol"/>
     </w:rPr>
   </w:style>
-  <w:style w:type="character" w:styleId="Bullets">
-    <w:name w:val="Bullets"/>
+  <w:style w:type="character" w:styleId="Bulletsuser">
+    <w:name w:val="Bullets (user)"/>
     <w:qFormat/>
     <w:rPr>
       <w:rFonts w:ascii="OpenSymbol" w:hAnsi="OpenSymbol" w:eastAsia="OpenSymbol" w:cs="OpenSymbol"/>

</xml_diff>